<commit_message>
Remove Appendix A tables, verify references with DOIs, add RQ3 control coefficient output
Co-Authored-By: Claude Sonnet 5.5 <noreply@anthropic.com>
Claude-Session: https://claude.ai/code/session_01TRgf3y9VxaCYQ3g7Rgi1uE
</commit_message>
<xml_diff>
--- a/revised/Manuscript_MISQ_Format_Final.docx
+++ b/revised/Manuscript_MISQ_Format_Final.docx
@@ -155,7 +155,16 @@
         <w:pStyle w:val="BodyText"/>
       </w:pPr>
       <w:r>
-        <w:t xml:space="preserve">The answer to RQ3 is that release probabilities respond to the volume of user issues but not distinguishably to bug reports as such. With non-bug issues held fixed, one standard deviation more bug reports in the previous week raises the log-odds of a release by 0.26 (wild cluster bootstrap p = 0.01), a response of about the same size as that to non-bug issues (0.22), and the additional response to bug reports at a given total volume is positive but not significant (0.19; wild cluster bootstrap p = 0.18). Releases show no detectable response to 38 upstream model launches, although release notes often mention a new model after its launch, which suggests that the content of releases responds while their timing does not. </w:t>
+        <w:t xml:space="preserve">The answer to RQ3 is that release probabilities respond to the volume of user issues but not distinguishably to bug reports as such. With non-bug issues held fixed, one standard deviation more bug reports in the previous week raises the log-odds of a release by 0.26 (wild cluster bootstrap p = 0.01), </w:t>
+      </w:r>
+      <w:r>
+        <w:rPr>
+          <w:highlight w:val="yellow"/>
+        </w:rPr>
+        <w:t xml:space="preserve">a response of about the same size as that to non-bug issues (0.22)</w:t>
+      </w:r>
+      <w:r>
+        <w:t xml:space="preserve">, and the additional response to bug reports at a given total volume is positive but not significant (0.19; wild cluster bootstrap p = 0.18). Releases show no detectable response to 38 upstream model launches, although release notes often mention a new model after its launch, which suggests that the content of releases responds while their timing does not. </w:t>
       </w:r>
     </w:p>
     <w:p>
@@ -748,7 +757,7 @@
         <w:t xml:space="preserve">cγμa</w:t>
       </w:r>
       <w:r>
-        <w:t xml:space="preserve"> per week, grows with age. A maintainer who weighs this cost against the cost of refreshing, subject to week-to-week noise in costs or attention, therefore refreshes with a probability that rises with age. This rising hazard is the signature of state dependence. Appendix A shows that the refresh probability is non-decreasing in drift in a discounted dynamic version of the model with unobserved payoff shocks (Rust 1987), and that the comparative statics of the threshold agree in direction numerically.</w:t>
+        <w:t xml:space="preserve"> per week, grows with age. A maintainer who weighs this cost against the cost of refreshing, subject to week-to-week noise in costs or attention, therefore refreshes with a probability that rises with age. This rising hazard is the signature of state dependence. Appendix A shows that the refresh probability is non-decreasing in drift in a discounted dynamic version of the model with unobserved payoff shocks (Rust 1987).</w:t>
       </w:r>
     </w:p>
     <w:p>
@@ -5412,7 +5421,16 @@
         <w:t xml:space="preserve">Equivalence tests.</w:t>
       </w:r>
       <w:r>
-        <w:t xml:space="preserve"> Because several of our results are null, for each of them we report a two one-sided test (TOST) p-value against a smallest effect of interest, the smallest bound at which equivalence would hold at the 5 percent level (the absolute estimate plus 1.645 standard errors), and the minimum detectable effect at 80 percent power (2.8 standard errors). The smallest effects of interest are a 2 percent weekly increase in the bug rate (RQ1); a log-odds of 0.25 per standard deviation of bug reports (RQ3), which is about the size of the response to non-bug issues that the data detect (Section 5.3); and 5 percentage points for upstream launches, about one eighth of the pre-launch release rate. These bounds are anchored to the data and are not independent of them, which is why the smallest bound for equivalence is reported as well and readers can apply their own.</w:t>
+        <w:t xml:space="preserve"> Because several of our results are null, for each of them we report a two one-sided test (TOST) p-value against a smallest effect of interest, the smallest bound at which equivalence would hold at the 5 percent level (the absolute estimate plus 1.645 standard errors), and the minimum detectable effect at 80 percent power (2.8 standard errors). The smallest effects of interest are a 2 percent weekly increase in the bug rate (RQ1); a log-odds of 0.25 per standard deviation of bug reports (RQ3), </w:t>
+      </w:r>
+      <w:r>
+        <w:rPr>
+          <w:highlight w:val="yellow"/>
+        </w:rPr>
+        <w:t xml:space="preserve">which is about the size of the response to non-bug issues that the data detect (Section 5.3)</w:t>
+      </w:r>
+      <w:r>
+        <w:t xml:space="preserve">; and 5 percentage points for upstream launches, about one eighth of the pre-launch release rate. These bounds are anchored to the data and are not independent of them, which is why the smallest bound for equivalence is reported as well and readers can apply their own.</w:t>
       </w:r>
     </w:p>
     <w:p>
@@ -5585,7 +5603,16 @@
         <w:pStyle w:val="FirstParagraph"/>
       </w:pPr>
       <w:r>
-        <w:t xml:space="preserve">Releases respond to the volume of user issues. With non-bug issues held fixed, one standard deviation more bug reports (in logs) in the previous week raises the log-odds of a release by 0.261 (clustered standard error 0.095; p = 0.01; wild cluster bootstrap p = 0.01). The point estimate on non-bug issues in the same model is 0.220, close to that on bug reports, so releases follow the overall flow of user reports at least as much as they follow defects. The three-week average of bug reports gives 0.332 (0.108; wild cluster bootstrap p = 0.01), and the three lags entered separately give 0.184, 0.096, and 0.055.</w:t>
+        <w:t xml:space="preserve">Releases respond to the volume of user issues. With non-bug issues held fixed, one standard deviation more bug reports (in logs) in the previous week raises the log-odds of a release by 0.261 (clustered standard error 0.095; p = 0.01; wild cluster bootstrap p = 0.01). </w:t>
+      </w:r>
+      <w:r>
+        <w:rPr>
+          <w:highlight w:val="yellow"/>
+        </w:rPr>
+        <w:t xml:space="preserve">The point estimate on non-bug issues in the same model is 0.220, close to that on bug reports, so releases follow the overall flow of user reports at least as much as they follow defects.</w:t>
+      </w:r>
+      <w:r>
+        <w:t xml:space="preserve"> The three-week average of bug reports gives 0.332 (0.108; wild cluster bootstrap p = 0.01), and the three lags entered separately give 0.184, 0.096, and 0.055.</w:t>
       </w:r>
     </w:p>
     <w:p>
@@ -6048,7 +6075,7 @@
         <w:t xml:space="preserve">x</w:t>
       </w:r>
       <w:r>
-        <w:t xml:space="preserve">, so the refresh probability is non-decreasing in drift. Over a wide range of parameter values, the optimal drift threshold is increasing in the refresh cost and in the speed of drift and decreasing in the discount factor, as the tables below show. These comparative statics are numerical regularities and not proved results. For the refresh cost and the speed of drift they agree in direction with the closed-form threshold </w:t>
+        <w:t xml:space="preserve">, so the refresh probability is non-decreasing in drift. The comparative statics of the threshold in the refresh cost and in the speed of drift are those of the closed-form threshold </w:t>
       </w:r>
       <w:r>
         <w:rPr>
@@ -6058,1171 +6085,11 @@
         <w:t xml:space="preserve">x</w:t>
       </w:r>
       <w:r>
-        <w:t xml:space="preserve">* of Section 3.2, which approximates the undiscounted case.</w:t>
-      </w:r>
-    </w:p>
-    <w:p>
-      <w:pPr>
-        <w:pStyle w:val="TableCaption"/>
-      </w:pPr>
-      <w:r>
-        <w:t xml:space="preserve">Table A1. Optimal drift threshold by refresh cost (other parameters as in Section 3.5)</w:t>
-      </w:r>
-    </w:p>
-    <w:tbl>
-      <w:tblPr>
-        <w:tblStyle w:val="Table"/>
-        <w:tblW w:w="7920" w:type="dxa"/>
-        <w:jc w:val="left"/>
-        <w:tblInd w:w="108" w:type="dxa"/>
-        <w:tblLayout w:type="fixed"/>
-        <w:tblCellMar>
-          <w:top w:w="0" w:type="dxa"/>
-          <w:left w:w="108" w:type="dxa"/>
-          <w:bottom w:w="0" w:type="dxa"/>
-          <w:right w:w="108" w:type="dxa"/>
-        </w:tblCellMar>
-        <w:tblLook w:val="0020" w:noHBand="0" w:noVBand="0" w:firstColumn="0" w:lastRow="0" w:lastColumn="0" w:firstRow="1"/>
-      </w:tblPr>
-      <w:tblGrid>
-        <w:gridCol w:w="1320"/>
-        <w:gridCol w:w="1319"/>
-        <w:gridCol w:w="1321"/>
-        <w:gridCol w:w="1320"/>
-        <w:gridCol w:w="1319"/>
-        <w:gridCol w:w="1320"/>
-      </w:tblGrid>
-      <w:tr>
-        <w:trPr>
-          <w:tblHeader w:val="true"/>
-        </w:trPr>
-        <w:tc>
-          <w:tcPr>
-            <w:tcW w:w="1320" w:type="dxa"/>
-            <w:tcBorders>
-              <w:bottom w:val="single" w:sz="6" w:space="0" w:color="000000"/>
-            </w:tcBorders>
-            <w:vAlign w:val="bottom"/>
-          </w:tcPr>
-          <w:p>
-            <w:pPr>
-              <w:pStyle w:val="Compact"/>
-              <w:widowControl/>
-              <w:spacing w:before="20" w:after="20"/>
-              <w:jc w:val="left"/>
-              <w:rPr>
-                <w:rFonts w:ascii="Times New Roman" w:hAnsi="Times New Roman" w:eastAsia="Times New Roman" w:cs="Times New Roman"/>
-                <w:kern w:val="0"/>
-                <w:sz w:val="20"/>
-                <w:szCs w:val="20"/>
-                <w:lang w:val="en-US" w:eastAsia="en-US" w:bidi="ar-SA"/>
-              </w:rPr>
-            </w:pPr>
-            <w:r>
-              <w:rPr>
-                <w:rFonts w:eastAsia="Times New Roman" w:cs="Times New Roman"/>
-                <w:kern w:val="0"/>
-                <w:sz w:val="20"/>
-                <w:szCs w:val="20"/>
-                <w:lang w:val="en-US" w:eastAsia="en-US" w:bidi="ar-SA"/>
-              </w:rPr>
-              <w:t xml:space="preserve">Refresh cost </w:t>
-            </w:r>
-            <w:r>
-              <w:rPr>
-                <w:rFonts w:eastAsia="Times New Roman" w:cs="Times New Roman"/>
-                <w:i/>
-                <w:iCs/>
-                <w:kern w:val="0"/>
-                <w:sz w:val="20"/>
-                <w:szCs w:val="20"/>
-                <w:lang w:val="en-US" w:eastAsia="en-US" w:bidi="ar-SA"/>
-              </w:rPr>
-              <w:t>RC</w:t>
-            </w:r>
-          </w:p>
-        </w:tc>
-        <w:tc>
-          <w:tcPr>
-            <w:tcW w:w="1319" w:type="dxa"/>
-            <w:tcBorders>
-              <w:bottom w:val="single" w:sz="6" w:space="0" w:color="000000"/>
-            </w:tcBorders>
-            <w:vAlign w:val="bottom"/>
-          </w:tcPr>
-          <w:p>
-            <w:pPr>
-              <w:pStyle w:val="Compact"/>
-              <w:widowControl/>
-              <w:spacing w:before="20" w:after="20"/>
-              <w:jc w:val="left"/>
-              <w:rPr>
-                <w:rFonts w:ascii="Times New Roman" w:hAnsi="Times New Roman" w:eastAsia="Times New Roman" w:cs="Times New Roman"/>
-                <w:kern w:val="0"/>
-                <w:sz w:val="20"/>
-                <w:szCs w:val="20"/>
-                <w:lang w:val="en-US" w:eastAsia="en-US" w:bidi="ar-SA"/>
-              </w:rPr>
-            </w:pPr>
-            <w:r>
-              <w:rPr>
-                <w:rFonts w:eastAsia="Times New Roman" w:cs="Times New Roman"/>
-                <w:kern w:val="0"/>
-                <w:sz w:val="20"/>
-                <w:szCs w:val="20"/>
-                <w:lang w:val="en-US" w:eastAsia="en-US" w:bidi="ar-SA"/>
-              </w:rPr>
-              <w:t>10</w:t>
-            </w:r>
-          </w:p>
-        </w:tc>
-        <w:tc>
-          <w:tcPr>
-            <w:tcW w:w="1321" w:type="dxa"/>
-            <w:tcBorders>
-              <w:bottom w:val="single" w:sz="6" w:space="0" w:color="000000"/>
-            </w:tcBorders>
-            <w:vAlign w:val="bottom"/>
-          </w:tcPr>
-          <w:p>
-            <w:pPr>
-              <w:pStyle w:val="Compact"/>
-              <w:widowControl/>
-              <w:spacing w:before="20" w:after="20"/>
-              <w:jc w:val="left"/>
-              <w:rPr>
-                <w:rFonts w:ascii="Times New Roman" w:hAnsi="Times New Roman" w:eastAsia="Times New Roman" w:cs="Times New Roman"/>
-                <w:kern w:val="0"/>
-                <w:sz w:val="20"/>
-                <w:szCs w:val="20"/>
-                <w:lang w:val="en-US" w:eastAsia="en-US" w:bidi="ar-SA"/>
-              </w:rPr>
-            </w:pPr>
-            <w:r>
-              <w:rPr>
-                <w:rFonts w:eastAsia="Times New Roman" w:cs="Times New Roman"/>
-                <w:kern w:val="0"/>
-                <w:sz w:val="20"/>
-                <w:szCs w:val="20"/>
-                <w:lang w:val="en-US" w:eastAsia="en-US" w:bidi="ar-SA"/>
-              </w:rPr>
-              <w:t>20</w:t>
-            </w:r>
-          </w:p>
-        </w:tc>
-        <w:tc>
-          <w:tcPr>
-            <w:tcW w:w="1320" w:type="dxa"/>
-            <w:tcBorders>
-              <w:bottom w:val="single" w:sz="6" w:space="0" w:color="000000"/>
-            </w:tcBorders>
-            <w:vAlign w:val="bottom"/>
-          </w:tcPr>
-          <w:p>
-            <w:pPr>
-              <w:pStyle w:val="Compact"/>
-              <w:widowControl/>
-              <w:spacing w:before="20" w:after="20"/>
-              <w:jc w:val="left"/>
-              <w:rPr>
-                <w:rFonts w:ascii="Times New Roman" w:hAnsi="Times New Roman" w:eastAsia="Times New Roman" w:cs="Times New Roman"/>
-                <w:kern w:val="0"/>
-                <w:sz w:val="20"/>
-                <w:szCs w:val="20"/>
-                <w:lang w:val="en-US" w:eastAsia="en-US" w:bidi="ar-SA"/>
-              </w:rPr>
-            </w:pPr>
-            <w:r>
-              <w:rPr>
-                <w:rFonts w:eastAsia="Times New Roman" w:cs="Times New Roman"/>
-                <w:kern w:val="0"/>
-                <w:sz w:val="20"/>
-                <w:szCs w:val="20"/>
-                <w:lang w:val="en-US" w:eastAsia="en-US" w:bidi="ar-SA"/>
-              </w:rPr>
-              <w:t>40</w:t>
-            </w:r>
-          </w:p>
-        </w:tc>
-        <w:tc>
-          <w:tcPr>
-            <w:tcW w:w="1319" w:type="dxa"/>
-            <w:tcBorders>
-              <w:bottom w:val="single" w:sz="6" w:space="0" w:color="000000"/>
-            </w:tcBorders>
-            <w:vAlign w:val="bottom"/>
-          </w:tcPr>
-          <w:p>
-            <w:pPr>
-              <w:pStyle w:val="Compact"/>
-              <w:widowControl/>
-              <w:spacing w:before="20" w:after="20"/>
-              <w:jc w:val="left"/>
-              <w:rPr>
-                <w:rFonts w:ascii="Times New Roman" w:hAnsi="Times New Roman" w:eastAsia="Times New Roman" w:cs="Times New Roman"/>
-                <w:kern w:val="0"/>
-                <w:sz w:val="20"/>
-                <w:szCs w:val="20"/>
-                <w:lang w:val="en-US" w:eastAsia="en-US" w:bidi="ar-SA"/>
-              </w:rPr>
-            </w:pPr>
-            <w:r>
-              <w:rPr>
-                <w:rFonts w:eastAsia="Times New Roman" w:cs="Times New Roman"/>
-                <w:kern w:val="0"/>
-                <w:sz w:val="20"/>
-                <w:szCs w:val="20"/>
-                <w:lang w:val="en-US" w:eastAsia="en-US" w:bidi="ar-SA"/>
-              </w:rPr>
-              <w:t>80</w:t>
-            </w:r>
-          </w:p>
-        </w:tc>
-        <w:tc>
-          <w:tcPr>
-            <w:tcW w:w="1320" w:type="dxa"/>
-            <w:tcBorders>
-              <w:bottom w:val="single" w:sz="6" w:space="0" w:color="000000"/>
-            </w:tcBorders>
-            <w:vAlign w:val="bottom"/>
-          </w:tcPr>
-          <w:p>
-            <w:pPr>
-              <w:pStyle w:val="Compact"/>
-              <w:widowControl/>
-              <w:spacing w:before="20" w:after="20"/>
-              <w:jc w:val="left"/>
-              <w:rPr>
-                <w:rFonts w:ascii="Times New Roman" w:hAnsi="Times New Roman" w:eastAsia="Times New Roman" w:cs="Times New Roman"/>
-                <w:kern w:val="0"/>
-                <w:sz w:val="20"/>
-                <w:szCs w:val="20"/>
-                <w:lang w:val="en-US" w:eastAsia="en-US" w:bidi="ar-SA"/>
-              </w:rPr>
-            </w:pPr>
-            <w:r>
-              <w:rPr>
-                <w:rFonts w:eastAsia="Times New Roman" w:cs="Times New Roman"/>
-                <w:kern w:val="0"/>
-                <w:sz w:val="20"/>
-                <w:szCs w:val="20"/>
-                <w:lang w:val="en-US" w:eastAsia="en-US" w:bidi="ar-SA"/>
-              </w:rPr>
-              <w:t>160</w:t>
-            </w:r>
-          </w:p>
-        </w:tc>
-      </w:tr>
-      <w:tr>
-        <w:trPr/>
-        <w:tc>
-          <w:tcPr>
-            <w:tcW w:w="1320" w:type="dxa"/>
-            <w:tcBorders>
-              <w:top w:val="single" w:sz="4" w:space="0" w:color="BBBBBB"/>
-            </w:tcBorders>
-          </w:tcPr>
-          <w:p>
-            <w:pPr>
-              <w:pStyle w:val="Compact"/>
-              <w:widowControl/>
-              <w:spacing w:before="20" w:after="20"/>
-              <w:jc w:val="left"/>
-              <w:rPr>
-                <w:rFonts w:ascii="Times New Roman" w:hAnsi="Times New Roman" w:eastAsia="Times New Roman" w:cs="Times New Roman"/>
-                <w:kern w:val="0"/>
-                <w:sz w:val="20"/>
-                <w:szCs w:val="20"/>
-                <w:lang w:val="en-US" w:eastAsia="en-US" w:bidi="ar-SA"/>
-              </w:rPr>
-            </w:pPr>
-            <w:r>
-              <w:rPr>
-                <w:rFonts w:eastAsia="Times New Roman" w:cs="Times New Roman"/>
-                <w:kern w:val="0"/>
-                <w:sz w:val="20"/>
-                <w:szCs w:val="20"/>
-                <w:lang w:val="en-US" w:eastAsia="en-US" w:bidi="ar-SA"/>
-              </w:rPr>
-              <w:t>Optimal drift threshold</w:t>
-            </w:r>
-          </w:p>
-        </w:tc>
-        <w:tc>
-          <w:tcPr>
-            <w:tcW w:w="1319" w:type="dxa"/>
-            <w:tcBorders>
-              <w:top w:val="single" w:sz="4" w:space="0" w:color="BBBBBB"/>
-            </w:tcBorders>
-          </w:tcPr>
-          <w:p>
-            <w:pPr>
-              <w:pStyle w:val="Compact"/>
-              <w:widowControl/>
-              <w:spacing w:before="20" w:after="20"/>
-              <w:jc w:val="left"/>
-              <w:rPr>
-                <w:rFonts w:ascii="Times New Roman" w:hAnsi="Times New Roman" w:eastAsia="Times New Roman" w:cs="Times New Roman"/>
-                <w:kern w:val="0"/>
-                <w:sz w:val="20"/>
-                <w:szCs w:val="20"/>
-                <w:lang w:val="en-US" w:eastAsia="en-US" w:bidi="ar-SA"/>
-              </w:rPr>
-            </w:pPr>
-            <w:r>
-              <w:rPr>
-                <w:rFonts w:eastAsia="Times New Roman" w:cs="Times New Roman"/>
-                <w:kern w:val="0"/>
-                <w:sz w:val="20"/>
-                <w:szCs w:val="20"/>
-                <w:lang w:val="en-US" w:eastAsia="en-US" w:bidi="ar-SA"/>
-              </w:rPr>
-              <w:t>7</w:t>
-            </w:r>
-          </w:p>
-        </w:tc>
-        <w:tc>
-          <w:tcPr>
-            <w:tcW w:w="1321" w:type="dxa"/>
-            <w:tcBorders>
-              <w:top w:val="single" w:sz="4" w:space="0" w:color="BBBBBB"/>
-            </w:tcBorders>
-          </w:tcPr>
-          <w:p>
-            <w:pPr>
-              <w:pStyle w:val="Compact"/>
-              <w:widowControl/>
-              <w:spacing w:before="20" w:after="20"/>
-              <w:jc w:val="left"/>
-              <w:rPr>
-                <w:rFonts w:ascii="Times New Roman" w:hAnsi="Times New Roman" w:eastAsia="Times New Roman" w:cs="Times New Roman"/>
-                <w:kern w:val="0"/>
-                <w:sz w:val="20"/>
-                <w:szCs w:val="20"/>
-                <w:lang w:val="en-US" w:eastAsia="en-US" w:bidi="ar-SA"/>
-              </w:rPr>
-            </w:pPr>
-            <w:r>
-              <w:rPr>
-                <w:rFonts w:eastAsia="Times New Roman" w:cs="Times New Roman"/>
-                <w:kern w:val="0"/>
-                <w:sz w:val="20"/>
-                <w:szCs w:val="20"/>
-                <w:lang w:val="en-US" w:eastAsia="en-US" w:bidi="ar-SA"/>
-              </w:rPr>
-              <w:t>10</w:t>
-            </w:r>
-          </w:p>
-        </w:tc>
-        <w:tc>
-          <w:tcPr>
-            <w:tcW w:w="1320" w:type="dxa"/>
-            <w:tcBorders>
-              <w:top w:val="single" w:sz="4" w:space="0" w:color="BBBBBB"/>
-            </w:tcBorders>
-          </w:tcPr>
-          <w:p>
-            <w:pPr>
-              <w:pStyle w:val="Compact"/>
-              <w:widowControl/>
-              <w:spacing w:before="20" w:after="20"/>
-              <w:jc w:val="left"/>
-              <w:rPr>
-                <w:rFonts w:ascii="Times New Roman" w:hAnsi="Times New Roman" w:eastAsia="Times New Roman" w:cs="Times New Roman"/>
-                <w:kern w:val="0"/>
-                <w:sz w:val="20"/>
-                <w:szCs w:val="20"/>
-                <w:lang w:val="en-US" w:eastAsia="en-US" w:bidi="ar-SA"/>
-              </w:rPr>
-            </w:pPr>
-            <w:r>
-              <w:rPr>
-                <w:rFonts w:eastAsia="Times New Roman" w:cs="Times New Roman"/>
-                <w:kern w:val="0"/>
-                <w:sz w:val="20"/>
-                <w:szCs w:val="20"/>
-                <w:lang w:val="en-US" w:eastAsia="en-US" w:bidi="ar-SA"/>
-              </w:rPr>
-              <w:t>14</w:t>
-            </w:r>
-          </w:p>
-        </w:tc>
-        <w:tc>
-          <w:tcPr>
-            <w:tcW w:w="1319" w:type="dxa"/>
-            <w:tcBorders>
-              <w:top w:val="single" w:sz="4" w:space="0" w:color="BBBBBB"/>
-            </w:tcBorders>
-          </w:tcPr>
-          <w:p>
-            <w:pPr>
-              <w:pStyle w:val="Compact"/>
-              <w:widowControl/>
-              <w:spacing w:before="20" w:after="20"/>
-              <w:jc w:val="left"/>
-              <w:rPr>
-                <w:rFonts w:ascii="Times New Roman" w:hAnsi="Times New Roman" w:eastAsia="Times New Roman" w:cs="Times New Roman"/>
-                <w:kern w:val="0"/>
-                <w:sz w:val="20"/>
-                <w:szCs w:val="20"/>
-                <w:lang w:val="en-US" w:eastAsia="en-US" w:bidi="ar-SA"/>
-              </w:rPr>
-            </w:pPr>
-            <w:r>
-              <w:rPr>
-                <w:rFonts w:eastAsia="Times New Roman" w:cs="Times New Roman"/>
-                <w:kern w:val="0"/>
-                <w:sz w:val="20"/>
-                <w:szCs w:val="20"/>
-                <w:lang w:val="en-US" w:eastAsia="en-US" w:bidi="ar-SA"/>
-              </w:rPr>
-              <w:t>21</w:t>
-            </w:r>
-          </w:p>
-        </w:tc>
-        <w:tc>
-          <w:tcPr>
-            <w:tcW w:w="1320" w:type="dxa"/>
-            <w:tcBorders>
-              <w:top w:val="single" w:sz="4" w:space="0" w:color="BBBBBB"/>
-            </w:tcBorders>
-          </w:tcPr>
-          <w:p>
-            <w:pPr>
-              <w:pStyle w:val="Compact"/>
-              <w:widowControl/>
-              <w:spacing w:before="20" w:after="20"/>
-              <w:jc w:val="left"/>
-              <w:rPr>
-                <w:rFonts w:ascii="Times New Roman" w:hAnsi="Times New Roman" w:eastAsia="Times New Roman" w:cs="Times New Roman"/>
-                <w:kern w:val="0"/>
-                <w:sz w:val="20"/>
-                <w:szCs w:val="20"/>
-                <w:lang w:val="en-US" w:eastAsia="en-US" w:bidi="ar-SA"/>
-              </w:rPr>
-            </w:pPr>
-            <w:r>
-              <w:rPr>
-                <w:rFonts w:eastAsia="Times New Roman" w:cs="Times New Roman"/>
-                <w:kern w:val="0"/>
-                <w:sz w:val="20"/>
-                <w:szCs w:val="20"/>
-                <w:lang w:val="en-US" w:eastAsia="en-US" w:bidi="ar-SA"/>
-              </w:rPr>
-              <w:t>32</w:t>
-            </w:r>
-          </w:p>
-        </w:tc>
-      </w:tr>
-    </w:tbl>
+        <w:t xml:space="preserve">* in Section 3.2, which approximates the undiscounted case. We do not derive the effect of the discount factor here.</w:t>
+      </w:r>
+    </w:p>
     <w:p/>
-    <w:p>
-      <w:pPr>
-        <w:pStyle w:val="TableCaption"/>
-      </w:pPr>
-      <w:r>
-        <w:t xml:space="preserve">Table A2. Optimal drift threshold by drift speed (other parameters as in Section 3.5)</w:t>
-      </w:r>
-    </w:p>
-    <w:tbl>
-      <w:tblPr>
-        <w:tblStyle w:val="Table"/>
-        <w:tblW w:w="7920" w:type="dxa"/>
-        <w:jc w:val="left"/>
-        <w:tblInd w:w="108" w:type="dxa"/>
-        <w:tblLayout w:type="fixed"/>
-        <w:tblCellMar>
-          <w:top w:w="0" w:type="dxa"/>
-          <w:left w:w="108" w:type="dxa"/>
-          <w:bottom w:w="0" w:type="dxa"/>
-          <w:right w:w="108" w:type="dxa"/>
-        </w:tblCellMar>
-        <w:tblLook w:val="0020" w:noHBand="0" w:noVBand="0" w:firstColumn="0" w:lastRow="0" w:lastColumn="0" w:firstRow="1"/>
-      </w:tblPr>
-      <w:tblGrid>
-        <w:gridCol w:w="1584"/>
-        <w:gridCol w:w="1584"/>
-        <w:gridCol w:w="1584"/>
-        <w:gridCol w:w="1584"/>
-        <w:gridCol w:w="1584"/>
-      </w:tblGrid>
-      <w:tr>
-        <w:trPr>
-          <w:tblHeader w:val="true"/>
-        </w:trPr>
-        <w:tc>
-          <w:tcPr>
-            <w:tcW w:w="1584" w:type="dxa"/>
-            <w:tcBorders>
-              <w:bottom w:val="single" w:sz="6" w:space="0" w:color="000000"/>
-            </w:tcBorders>
-            <w:vAlign w:val="bottom"/>
-          </w:tcPr>
-          <w:p>
-            <w:pPr>
-              <w:pStyle w:val="Compact"/>
-              <w:widowControl/>
-              <w:spacing w:before="20" w:after="20"/>
-              <w:jc w:val="left"/>
-              <w:rPr>
-                <w:rFonts w:ascii="Times New Roman" w:hAnsi="Times New Roman" w:eastAsia="Times New Roman" w:cs="Times New Roman"/>
-                <w:kern w:val="0"/>
-                <w:sz w:val="20"/>
-                <w:szCs w:val="20"/>
-                <w:lang w:val="en-US" w:eastAsia="en-US" w:bidi="ar-SA"/>
-              </w:rPr>
-            </w:pPr>
-            <w:r>
-              <w:rPr>
-                <w:rFonts w:eastAsia="Times New Roman" w:cs="Times New Roman"/>
-                <w:kern w:val="0"/>
-                <w:sz w:val="20"/>
-                <w:szCs w:val="20"/>
-                <w:lang w:val="en-US" w:eastAsia="en-US" w:bidi="ar-SA"/>
-              </w:rPr>
-              <w:t xml:space="preserve">Drift speed </w:t>
-            </w:r>
-            <w:r>
-              <w:rPr>
-                <w:rFonts w:eastAsia="Times New Roman" w:cs="Times New Roman"/>
-                <w:i/>
-                <w:iCs/>
-                <w:kern w:val="0"/>
-                <w:sz w:val="20"/>
-                <w:szCs w:val="20"/>
-                <w:lang w:val="en-US" w:eastAsia="en-US" w:bidi="ar-SA"/>
-              </w:rPr>
-              <w:t>μ</w:t>
-            </w:r>
-          </w:p>
-        </w:tc>
-        <w:tc>
-          <w:tcPr>
-            <w:tcW w:w="1584" w:type="dxa"/>
-            <w:tcBorders>
-              <w:bottom w:val="single" w:sz="6" w:space="0" w:color="000000"/>
-            </w:tcBorders>
-            <w:vAlign w:val="bottom"/>
-          </w:tcPr>
-          <w:p>
-            <w:pPr>
-              <w:pStyle w:val="Compact"/>
-              <w:widowControl/>
-              <w:spacing w:before="20" w:after="20"/>
-              <w:jc w:val="left"/>
-              <w:rPr>
-                <w:rFonts w:ascii="Times New Roman" w:hAnsi="Times New Roman" w:eastAsia="Times New Roman" w:cs="Times New Roman"/>
-                <w:kern w:val="0"/>
-                <w:sz w:val="20"/>
-                <w:szCs w:val="20"/>
-                <w:lang w:val="en-US" w:eastAsia="en-US" w:bidi="ar-SA"/>
-              </w:rPr>
-            </w:pPr>
-            <w:r>
-              <w:rPr>
-                <w:rFonts w:eastAsia="Times New Roman" w:cs="Times New Roman"/>
-                <w:kern w:val="0"/>
-                <w:sz w:val="20"/>
-                <w:szCs w:val="20"/>
-                <w:lang w:val="en-US" w:eastAsia="en-US" w:bidi="ar-SA"/>
-              </w:rPr>
-              <w:t>0.5</w:t>
-            </w:r>
-          </w:p>
-        </w:tc>
-        <w:tc>
-          <w:tcPr>
-            <w:tcW w:w="1584" w:type="dxa"/>
-            <w:tcBorders>
-              <w:bottom w:val="single" w:sz="6" w:space="0" w:color="000000"/>
-            </w:tcBorders>
-            <w:vAlign w:val="bottom"/>
-          </w:tcPr>
-          <w:p>
-            <w:pPr>
-              <w:pStyle w:val="Compact"/>
-              <w:widowControl/>
-              <w:spacing w:before="20" w:after="20"/>
-              <w:jc w:val="left"/>
-              <w:rPr>
-                <w:rFonts w:ascii="Times New Roman" w:hAnsi="Times New Roman" w:eastAsia="Times New Roman" w:cs="Times New Roman"/>
-                <w:kern w:val="0"/>
-                <w:sz w:val="20"/>
-                <w:szCs w:val="20"/>
-                <w:lang w:val="en-US" w:eastAsia="en-US" w:bidi="ar-SA"/>
-              </w:rPr>
-            </w:pPr>
-            <w:r>
-              <w:rPr>
-                <w:rFonts w:eastAsia="Times New Roman" w:cs="Times New Roman"/>
-                <w:kern w:val="0"/>
-                <w:sz w:val="20"/>
-                <w:szCs w:val="20"/>
-                <w:lang w:val="en-US" w:eastAsia="en-US" w:bidi="ar-SA"/>
-              </w:rPr>
-              <w:t>1.0</w:t>
-            </w:r>
-          </w:p>
-        </w:tc>
-        <w:tc>
-          <w:tcPr>
-            <w:tcW w:w="1584" w:type="dxa"/>
-            <w:tcBorders>
-              <w:bottom w:val="single" w:sz="6" w:space="0" w:color="000000"/>
-            </w:tcBorders>
-            <w:vAlign w:val="bottom"/>
-          </w:tcPr>
-          <w:p>
-            <w:pPr>
-              <w:pStyle w:val="Compact"/>
-              <w:widowControl/>
-              <w:spacing w:before="20" w:after="20"/>
-              <w:jc w:val="left"/>
-              <w:rPr>
-                <w:rFonts w:ascii="Times New Roman" w:hAnsi="Times New Roman" w:eastAsia="Times New Roman" w:cs="Times New Roman"/>
-                <w:kern w:val="0"/>
-                <w:sz w:val="20"/>
-                <w:szCs w:val="20"/>
-                <w:lang w:val="en-US" w:eastAsia="en-US" w:bidi="ar-SA"/>
-              </w:rPr>
-            </w:pPr>
-            <w:r>
-              <w:rPr>
-                <w:rFonts w:eastAsia="Times New Roman" w:cs="Times New Roman"/>
-                <w:kern w:val="0"/>
-                <w:sz w:val="20"/>
-                <w:szCs w:val="20"/>
-                <w:lang w:val="en-US" w:eastAsia="en-US" w:bidi="ar-SA"/>
-              </w:rPr>
-              <w:t>1.5</w:t>
-            </w:r>
-          </w:p>
-        </w:tc>
-        <w:tc>
-          <w:tcPr>
-            <w:tcW w:w="1584" w:type="dxa"/>
-            <w:tcBorders>
-              <w:bottom w:val="single" w:sz="6" w:space="0" w:color="000000"/>
-            </w:tcBorders>
-            <w:vAlign w:val="bottom"/>
-          </w:tcPr>
-          <w:p>
-            <w:pPr>
-              <w:pStyle w:val="Compact"/>
-              <w:widowControl/>
-              <w:spacing w:before="20" w:after="20"/>
-              <w:jc w:val="left"/>
-              <w:rPr>
-                <w:rFonts w:ascii="Times New Roman" w:hAnsi="Times New Roman" w:eastAsia="Times New Roman" w:cs="Times New Roman"/>
-                <w:kern w:val="0"/>
-                <w:sz w:val="20"/>
-                <w:szCs w:val="20"/>
-                <w:lang w:val="en-US" w:eastAsia="en-US" w:bidi="ar-SA"/>
-              </w:rPr>
-            </w:pPr>
-            <w:r>
-              <w:rPr>
-                <w:rFonts w:eastAsia="Times New Roman" w:cs="Times New Roman"/>
-                <w:kern w:val="0"/>
-                <w:sz w:val="20"/>
-                <w:szCs w:val="20"/>
-                <w:lang w:val="en-US" w:eastAsia="en-US" w:bidi="ar-SA"/>
-              </w:rPr>
-              <w:t>2.0</w:t>
-            </w:r>
-          </w:p>
-        </w:tc>
-      </w:tr>
-      <w:tr>
-        <w:trPr/>
-        <w:tc>
-          <w:tcPr>
-            <w:tcW w:w="1584" w:type="dxa"/>
-            <w:tcBorders>
-              <w:top w:val="single" w:sz="4" w:space="0" w:color="BBBBBB"/>
-            </w:tcBorders>
-          </w:tcPr>
-          <w:p>
-            <w:pPr>
-              <w:pStyle w:val="Compact"/>
-              <w:widowControl/>
-              <w:spacing w:before="20" w:after="20"/>
-              <w:jc w:val="left"/>
-              <w:rPr>
-                <w:rFonts w:ascii="Times New Roman" w:hAnsi="Times New Roman" w:eastAsia="Times New Roman" w:cs="Times New Roman"/>
-                <w:kern w:val="0"/>
-                <w:sz w:val="20"/>
-                <w:szCs w:val="20"/>
-                <w:lang w:val="en-US" w:eastAsia="en-US" w:bidi="ar-SA"/>
-              </w:rPr>
-            </w:pPr>
-            <w:r>
-              <w:rPr>
-                <w:rFonts w:eastAsia="Times New Roman" w:cs="Times New Roman"/>
-                <w:kern w:val="0"/>
-                <w:sz w:val="20"/>
-                <w:szCs w:val="20"/>
-                <w:lang w:val="en-US" w:eastAsia="en-US" w:bidi="ar-SA"/>
-              </w:rPr>
-              <w:t>Optimal drift threshold</w:t>
-            </w:r>
-          </w:p>
-        </w:tc>
-        <w:tc>
-          <w:tcPr>
-            <w:tcW w:w="1584" w:type="dxa"/>
-            <w:tcBorders>
-              <w:top w:val="single" w:sz="4" w:space="0" w:color="BBBBBB"/>
-            </w:tcBorders>
-          </w:tcPr>
-          <w:p>
-            <w:pPr>
-              <w:pStyle w:val="Compact"/>
-              <w:widowControl/>
-              <w:spacing w:before="20" w:after="20"/>
-              <w:jc w:val="left"/>
-              <w:rPr>
-                <w:rFonts w:ascii="Times New Roman" w:hAnsi="Times New Roman" w:eastAsia="Times New Roman" w:cs="Times New Roman"/>
-                <w:kern w:val="0"/>
-                <w:sz w:val="20"/>
-                <w:szCs w:val="20"/>
-                <w:lang w:val="en-US" w:eastAsia="en-US" w:bidi="ar-SA"/>
-              </w:rPr>
-            </w:pPr>
-            <w:r>
-              <w:rPr>
-                <w:rFonts w:eastAsia="Times New Roman" w:cs="Times New Roman"/>
-                <w:kern w:val="0"/>
-                <w:sz w:val="20"/>
-                <w:szCs w:val="20"/>
-                <w:lang w:val="en-US" w:eastAsia="en-US" w:bidi="ar-SA"/>
-              </w:rPr>
-              <w:t>11</w:t>
-            </w:r>
-          </w:p>
-        </w:tc>
-        <w:tc>
-          <w:tcPr>
-            <w:tcW w:w="1584" w:type="dxa"/>
-            <w:tcBorders>
-              <w:top w:val="single" w:sz="4" w:space="0" w:color="BBBBBB"/>
-            </w:tcBorders>
-          </w:tcPr>
-          <w:p>
-            <w:pPr>
-              <w:pStyle w:val="Compact"/>
-              <w:widowControl/>
-              <w:spacing w:before="20" w:after="20"/>
-              <w:jc w:val="left"/>
-              <w:rPr>
-                <w:rFonts w:ascii="Times New Roman" w:hAnsi="Times New Roman" w:eastAsia="Times New Roman" w:cs="Times New Roman"/>
-                <w:kern w:val="0"/>
-                <w:sz w:val="20"/>
-                <w:szCs w:val="20"/>
-                <w:lang w:val="en-US" w:eastAsia="en-US" w:bidi="ar-SA"/>
-              </w:rPr>
-            </w:pPr>
-            <w:r>
-              <w:rPr>
-                <w:rFonts w:eastAsia="Times New Roman" w:cs="Times New Roman"/>
-                <w:kern w:val="0"/>
-                <w:sz w:val="20"/>
-                <w:szCs w:val="20"/>
-                <w:lang w:val="en-US" w:eastAsia="en-US" w:bidi="ar-SA"/>
-              </w:rPr>
-              <w:t>14</w:t>
-            </w:r>
-          </w:p>
-        </w:tc>
-        <w:tc>
-          <w:tcPr>
-            <w:tcW w:w="1584" w:type="dxa"/>
-            <w:tcBorders>
-              <w:top w:val="single" w:sz="4" w:space="0" w:color="BBBBBB"/>
-            </w:tcBorders>
-          </w:tcPr>
-          <w:p>
-            <w:pPr>
-              <w:pStyle w:val="Compact"/>
-              <w:widowControl/>
-              <w:spacing w:before="20" w:after="20"/>
-              <w:jc w:val="left"/>
-              <w:rPr>
-                <w:rFonts w:ascii="Times New Roman" w:hAnsi="Times New Roman" w:eastAsia="Times New Roman" w:cs="Times New Roman"/>
-                <w:kern w:val="0"/>
-                <w:sz w:val="20"/>
-                <w:szCs w:val="20"/>
-                <w:lang w:val="en-US" w:eastAsia="en-US" w:bidi="ar-SA"/>
-              </w:rPr>
-            </w:pPr>
-            <w:r>
-              <w:rPr>
-                <w:rFonts w:eastAsia="Times New Roman" w:cs="Times New Roman"/>
-                <w:kern w:val="0"/>
-                <w:sz w:val="20"/>
-                <w:szCs w:val="20"/>
-                <w:lang w:val="en-US" w:eastAsia="en-US" w:bidi="ar-SA"/>
-              </w:rPr>
-              <w:t>17</w:t>
-            </w:r>
-          </w:p>
-        </w:tc>
-        <w:tc>
-          <w:tcPr>
-            <w:tcW w:w="1584" w:type="dxa"/>
-            <w:tcBorders>
-              <w:top w:val="single" w:sz="4" w:space="0" w:color="BBBBBB"/>
-            </w:tcBorders>
-          </w:tcPr>
-          <w:p>
-            <w:pPr>
-              <w:pStyle w:val="Compact"/>
-              <w:widowControl/>
-              <w:spacing w:before="20" w:after="20"/>
-              <w:jc w:val="left"/>
-              <w:rPr>
-                <w:rFonts w:ascii="Times New Roman" w:hAnsi="Times New Roman" w:eastAsia="Times New Roman" w:cs="Times New Roman"/>
-                <w:kern w:val="0"/>
-                <w:sz w:val="20"/>
-                <w:szCs w:val="20"/>
-                <w:lang w:val="en-US" w:eastAsia="en-US" w:bidi="ar-SA"/>
-              </w:rPr>
-            </w:pPr>
-            <w:r>
-              <w:rPr>
-                <w:rFonts w:eastAsia="Times New Roman" w:cs="Times New Roman"/>
-                <w:kern w:val="0"/>
-                <w:sz w:val="20"/>
-                <w:szCs w:val="20"/>
-                <w:lang w:val="en-US" w:eastAsia="en-US" w:bidi="ar-SA"/>
-              </w:rPr>
-              <w:t>19</w:t>
-            </w:r>
-          </w:p>
-        </w:tc>
-      </w:tr>
-    </w:tbl>
     <w:p/>
-    <w:p>
-      <w:pPr>
-        <w:pStyle w:val="TableCaption"/>
-      </w:pPr>
-      <w:r>
-        <w:t xml:space="preserve">Table A3. Optimal drift threshold by discount factor (other parameters as in Section 3.5)</w:t>
-      </w:r>
-    </w:p>
-    <w:tbl>
-      <w:tblPr>
-        <w:tblStyle w:val="Table"/>
-        <w:tblW w:w="7920" w:type="dxa"/>
-        <w:jc w:val="left"/>
-        <w:tblInd w:w="108" w:type="dxa"/>
-        <w:tblLayout w:type="fixed"/>
-        <w:tblCellMar>
-          <w:top w:w="0" w:type="dxa"/>
-          <w:left w:w="108" w:type="dxa"/>
-          <w:bottom w:w="0" w:type="dxa"/>
-          <w:right w:w="108" w:type="dxa"/>
-        </w:tblCellMar>
-        <w:tblLook w:val="0020" w:noHBand="0" w:noVBand="0" w:firstColumn="0" w:lastRow="0" w:lastColumn="0" w:firstRow="1"/>
-      </w:tblPr>
-      <w:tblGrid>
-        <w:gridCol w:w="1980"/>
-        <w:gridCol w:w="1980"/>
-        <w:gridCol w:w="1980"/>
-        <w:gridCol w:w="1979"/>
-      </w:tblGrid>
-      <w:tr>
-        <w:trPr>
-          <w:tblHeader w:val="true"/>
-        </w:trPr>
-        <w:tc>
-          <w:tcPr>
-            <w:tcW w:w="1980" w:type="dxa"/>
-            <w:tcBorders>
-              <w:bottom w:val="single" w:sz="6" w:space="0" w:color="000000"/>
-            </w:tcBorders>
-            <w:vAlign w:val="bottom"/>
-          </w:tcPr>
-          <w:p>
-            <w:pPr>
-              <w:pStyle w:val="Compact"/>
-              <w:widowControl/>
-              <w:spacing w:before="20" w:after="20"/>
-              <w:jc w:val="left"/>
-              <w:rPr>
-                <w:rFonts w:ascii="Times New Roman" w:hAnsi="Times New Roman" w:eastAsia="Times New Roman" w:cs="Times New Roman"/>
-                <w:kern w:val="0"/>
-                <w:sz w:val="20"/>
-                <w:szCs w:val="20"/>
-                <w:lang w:val="en-US" w:eastAsia="en-US" w:bidi="ar-SA"/>
-              </w:rPr>
-            </w:pPr>
-            <w:r>
-              <w:rPr>
-                <w:rFonts w:eastAsia="Times New Roman" w:cs="Times New Roman"/>
-                <w:kern w:val="0"/>
-                <w:sz w:val="20"/>
-                <w:szCs w:val="20"/>
-                <w:lang w:val="en-US" w:eastAsia="en-US" w:bidi="ar-SA"/>
-              </w:rPr>
-              <w:t xml:space="preserve">Discount factor </w:t>
-            </w:r>
-            <w:r>
-              <w:rPr>
-                <w:rFonts w:eastAsia="Times New Roman" w:cs="Times New Roman"/>
-                <w:i/>
-                <w:iCs/>
-                <w:kern w:val="0"/>
-                <w:sz w:val="20"/>
-                <w:szCs w:val="20"/>
-                <w:lang w:val="en-US" w:eastAsia="en-US" w:bidi="ar-SA"/>
-              </w:rPr>
-              <w:t>β</w:t>
-            </w:r>
-          </w:p>
-        </w:tc>
-        <w:tc>
-          <w:tcPr>
-            <w:tcW w:w="1980" w:type="dxa"/>
-            <w:tcBorders>
-              <w:bottom w:val="single" w:sz="6" w:space="0" w:color="000000"/>
-            </w:tcBorders>
-            <w:vAlign w:val="bottom"/>
-          </w:tcPr>
-          <w:p>
-            <w:pPr>
-              <w:pStyle w:val="Compact"/>
-              <w:widowControl/>
-              <w:spacing w:before="20" w:after="20"/>
-              <w:jc w:val="left"/>
-              <w:rPr>
-                <w:rFonts w:ascii="Times New Roman" w:hAnsi="Times New Roman" w:eastAsia="Times New Roman" w:cs="Times New Roman"/>
-                <w:kern w:val="0"/>
-                <w:sz w:val="20"/>
-                <w:szCs w:val="20"/>
-                <w:lang w:val="en-US" w:eastAsia="en-US" w:bidi="ar-SA"/>
-              </w:rPr>
-            </w:pPr>
-            <w:r>
-              <w:rPr>
-                <w:rFonts w:eastAsia="Times New Roman" w:cs="Times New Roman"/>
-                <w:kern w:val="0"/>
-                <w:sz w:val="20"/>
-                <w:szCs w:val="20"/>
-                <w:lang w:val="en-US" w:eastAsia="en-US" w:bidi="ar-SA"/>
-              </w:rPr>
-              <w:t>0.90</w:t>
-            </w:r>
-          </w:p>
-        </w:tc>
-        <w:tc>
-          <w:tcPr>
-            <w:tcW w:w="1980" w:type="dxa"/>
-            <w:tcBorders>
-              <w:bottom w:val="single" w:sz="6" w:space="0" w:color="000000"/>
-            </w:tcBorders>
-            <w:vAlign w:val="bottom"/>
-          </w:tcPr>
-          <w:p>
-            <w:pPr>
-              <w:pStyle w:val="Compact"/>
-              <w:widowControl/>
-              <w:spacing w:before="20" w:after="20"/>
-              <w:jc w:val="left"/>
-              <w:rPr>
-                <w:rFonts w:ascii="Times New Roman" w:hAnsi="Times New Roman" w:eastAsia="Times New Roman" w:cs="Times New Roman"/>
-                <w:kern w:val="0"/>
-                <w:sz w:val="20"/>
-                <w:szCs w:val="20"/>
-                <w:lang w:val="en-US" w:eastAsia="en-US" w:bidi="ar-SA"/>
-              </w:rPr>
-            </w:pPr>
-            <w:r>
-              <w:rPr>
-                <w:rFonts w:eastAsia="Times New Roman" w:cs="Times New Roman"/>
-                <w:kern w:val="0"/>
-                <w:sz w:val="20"/>
-                <w:szCs w:val="20"/>
-                <w:lang w:val="en-US" w:eastAsia="en-US" w:bidi="ar-SA"/>
-              </w:rPr>
-              <w:t>0.95</w:t>
-            </w:r>
-          </w:p>
-        </w:tc>
-        <w:tc>
-          <w:tcPr>
-            <w:tcW w:w="1979" w:type="dxa"/>
-            <w:tcBorders>
-              <w:bottom w:val="single" w:sz="6" w:space="0" w:color="000000"/>
-            </w:tcBorders>
-            <w:vAlign w:val="bottom"/>
-          </w:tcPr>
-          <w:p>
-            <w:pPr>
-              <w:pStyle w:val="Compact"/>
-              <w:widowControl/>
-              <w:spacing w:before="20" w:after="20"/>
-              <w:jc w:val="left"/>
-              <w:rPr>
-                <w:rFonts w:ascii="Times New Roman" w:hAnsi="Times New Roman" w:eastAsia="Times New Roman" w:cs="Times New Roman"/>
-                <w:kern w:val="0"/>
-                <w:sz w:val="20"/>
-                <w:szCs w:val="20"/>
-                <w:lang w:val="en-US" w:eastAsia="en-US" w:bidi="ar-SA"/>
-              </w:rPr>
-            </w:pPr>
-            <w:r>
-              <w:rPr>
-                <w:rFonts w:eastAsia="Times New Roman" w:cs="Times New Roman"/>
-                <w:kern w:val="0"/>
-                <w:sz w:val="20"/>
-                <w:szCs w:val="20"/>
-                <w:lang w:val="en-US" w:eastAsia="en-US" w:bidi="ar-SA"/>
-              </w:rPr>
-              <w:t>0.99</w:t>
-            </w:r>
-          </w:p>
-        </w:tc>
-      </w:tr>
-      <w:tr>
-        <w:trPr/>
-        <w:tc>
-          <w:tcPr>
-            <w:tcW w:w="1980" w:type="dxa"/>
-            <w:tcBorders>
-              <w:top w:val="single" w:sz="4" w:space="0" w:color="BBBBBB"/>
-            </w:tcBorders>
-          </w:tcPr>
-          <w:p>
-            <w:pPr>
-              <w:pStyle w:val="Compact"/>
-              <w:widowControl/>
-              <w:spacing w:before="20" w:after="20"/>
-              <w:jc w:val="left"/>
-              <w:rPr>
-                <w:rFonts w:ascii="Times New Roman" w:hAnsi="Times New Roman" w:eastAsia="Times New Roman" w:cs="Times New Roman"/>
-                <w:kern w:val="0"/>
-                <w:sz w:val="20"/>
-                <w:szCs w:val="20"/>
-                <w:lang w:val="en-US" w:eastAsia="en-US" w:bidi="ar-SA"/>
-              </w:rPr>
-            </w:pPr>
-            <w:r>
-              <w:rPr>
-                <w:rFonts w:eastAsia="Times New Roman" w:cs="Times New Roman"/>
-                <w:kern w:val="0"/>
-                <w:sz w:val="20"/>
-                <w:szCs w:val="20"/>
-                <w:lang w:val="en-US" w:eastAsia="en-US" w:bidi="ar-SA"/>
-              </w:rPr>
-              <w:t>Optimal drift threshold</w:t>
-            </w:r>
-          </w:p>
-        </w:tc>
-        <w:tc>
-          <w:tcPr>
-            <w:tcW w:w="1980" w:type="dxa"/>
-            <w:tcBorders>
-              <w:top w:val="single" w:sz="4" w:space="0" w:color="BBBBBB"/>
-            </w:tcBorders>
-          </w:tcPr>
-          <w:p>
-            <w:pPr>
-              <w:pStyle w:val="Compact"/>
-              <w:widowControl/>
-              <w:spacing w:before="20" w:after="20"/>
-              <w:jc w:val="left"/>
-              <w:rPr>
-                <w:rFonts w:ascii="Times New Roman" w:hAnsi="Times New Roman" w:eastAsia="Times New Roman" w:cs="Times New Roman"/>
-                <w:kern w:val="0"/>
-                <w:sz w:val="20"/>
-                <w:szCs w:val="20"/>
-                <w:lang w:val="en-US" w:eastAsia="en-US" w:bidi="ar-SA"/>
-              </w:rPr>
-            </w:pPr>
-            <w:r>
-              <w:rPr>
-                <w:rFonts w:eastAsia="Times New Roman" w:cs="Times New Roman"/>
-                <w:kern w:val="0"/>
-                <w:sz w:val="20"/>
-                <w:szCs w:val="20"/>
-                <w:lang w:val="en-US" w:eastAsia="en-US" w:bidi="ar-SA"/>
-              </w:rPr>
-              <w:t>16</w:t>
-            </w:r>
-          </w:p>
-        </w:tc>
-        <w:tc>
-          <w:tcPr>
-            <w:tcW w:w="1980" w:type="dxa"/>
-            <w:tcBorders>
-              <w:top w:val="single" w:sz="4" w:space="0" w:color="BBBBBB"/>
-            </w:tcBorders>
-          </w:tcPr>
-          <w:p>
-            <w:pPr>
-              <w:pStyle w:val="Compact"/>
-              <w:widowControl/>
-              <w:spacing w:before="20" w:after="20"/>
-              <w:jc w:val="left"/>
-              <w:rPr>
-                <w:rFonts w:ascii="Times New Roman" w:hAnsi="Times New Roman" w:eastAsia="Times New Roman" w:cs="Times New Roman"/>
-                <w:kern w:val="0"/>
-                <w:sz w:val="20"/>
-                <w:szCs w:val="20"/>
-                <w:lang w:val="en-US" w:eastAsia="en-US" w:bidi="ar-SA"/>
-              </w:rPr>
-            </w:pPr>
-            <w:r>
-              <w:rPr>
-                <w:rFonts w:eastAsia="Times New Roman" w:cs="Times New Roman"/>
-                <w:kern w:val="0"/>
-                <w:sz w:val="20"/>
-                <w:szCs w:val="20"/>
-                <w:lang w:val="en-US" w:eastAsia="en-US" w:bidi="ar-SA"/>
-              </w:rPr>
-              <w:t>14</w:t>
-            </w:r>
-          </w:p>
-        </w:tc>
-        <w:tc>
-          <w:tcPr>
-            <w:tcW w:w="1979" w:type="dxa"/>
-            <w:tcBorders>
-              <w:top w:val="single" w:sz="4" w:space="0" w:color="BBBBBB"/>
-            </w:tcBorders>
-          </w:tcPr>
-          <w:p>
-            <w:pPr>
-              <w:pStyle w:val="Compact"/>
-              <w:widowControl/>
-              <w:spacing w:before="20" w:after="20"/>
-              <w:jc w:val="left"/>
-              <w:rPr>
-                <w:rFonts w:ascii="Times New Roman" w:hAnsi="Times New Roman" w:eastAsia="Times New Roman" w:cs="Times New Roman"/>
-                <w:kern w:val="0"/>
-                <w:sz w:val="20"/>
-                <w:szCs w:val="20"/>
-                <w:lang w:val="en-US" w:eastAsia="en-US" w:bidi="ar-SA"/>
-              </w:rPr>
-            </w:pPr>
-            <w:r>
-              <w:rPr>
-                <w:rFonts w:eastAsia="Times New Roman" w:cs="Times New Roman"/>
-                <w:kern w:val="0"/>
-                <w:sz w:val="20"/>
-                <w:szCs w:val="20"/>
-                <w:lang w:val="en-US" w:eastAsia="en-US" w:bidi="ar-SA"/>
-              </w:rPr>
-              <w:t>13</w:t>
-            </w:r>
-            <w:bookmarkStart w:id="27" w:name="X9c2d2319a2c40fad0b893d6b242d542108da474"/>
-            <w:bookmarkEnd w:id="27"/>
-          </w:p>
-        </w:tc>
-      </w:tr>
-    </w:tbl>
     <w:p>
       <w:pPr>
         <w:pStyle w:val="Heading2"/>
@@ -7247,7 +6114,7 @@
         <w:t xml:space="preserve">Journal of Econometrics</w:t>
       </w:r>
       <w:r>
-        <w:t xml:space="preserve"> (156:1), pp. 38–67.</w:t>
+        <w:t xml:space="preserve"> (156:1), pp. 38–67. https://doi.org/10.1016/j.jeconom.2009.09.007</w:t>
       </w:r>
     </w:p>
     <w:p>
@@ -7265,7 +6132,7 @@
         <w:t xml:space="preserve">Quarterly Journal of Economics</w:t>
       </w:r>
       <w:r>
-        <w:t xml:space="preserve"> (126:4), pp. 1909–1960.</w:t>
+        <w:t xml:space="preserve"> (126:4), pp. 1909–1960. https://doi.org/10.1093/qje/qjr043</w:t>
       </w:r>
     </w:p>
     <w:p>
@@ -7283,7 +6150,7 @@
         <w:t xml:space="preserve">Proceedings of the 41st International Conference on Software Engineering: Software Engineering in Practice (ICSE-SEIP)</w:t>
       </w:r>
       <w:r>
-        <w:t xml:space="preserve">, pp. 291–300.</w:t>
+        <w:t xml:space="preserve">, pp. 291–300. https://doi.org/10.1109/ICSE-SEIP.2019.00042</w:t>
       </w:r>
     </w:p>
     <w:p>
@@ -7301,7 +6168,7 @@
         <w:t xml:space="preserve">Communications of the ACM</w:t>
       </w:r>
       <w:r>
-        <w:t xml:space="preserve"> (36:11), pp. 81–94.</w:t>
+        <w:t xml:space="preserve"> (36:11), pp. 81–94. https://doi.org/10.1145/163359.163375</w:t>
       </w:r>
     </w:p>
     <w:p>
@@ -7319,7 +6186,7 @@
         <w:t xml:space="preserve">Operations Research</w:t>
       </w:r>
       <w:r>
-        <w:t xml:space="preserve"> (8:1), pp. 90–100.</w:t>
+        <w:t xml:space="preserve"> (8:1), pp. 90–100. https://doi.org/10.1287/opre.8.1.90</w:t>
       </w:r>
     </w:p>
     <w:p>
@@ -7337,7 +6204,7 @@
         <w:t xml:space="preserve">Econometrica</w:t>
       </w:r>
       <w:r>
-        <w:t xml:space="preserve"> (67:4), pp. 783–826.</w:t>
+        <w:t xml:space="preserve"> (67:4), pp. 783–826. https://doi.org/10.1111/1468-0262.00053</w:t>
       </w:r>
     </w:p>
     <w:p>
@@ -7355,7 +6222,7 @@
         <w:t xml:space="preserve">Journal of Monetary Economics</w:t>
       </w:r>
       <w:r>
-        <w:t xml:space="preserve"> (12:3), pp. 383–398.</w:t>
+        <w:t xml:space="preserve"> (12:3), pp. 383–398. https://doi.org/10.1016/0304-3932(83)90060-0</w:t>
       </w:r>
     </w:p>
     <w:p>
@@ -7373,7 +6240,7 @@
         <w:t xml:space="preserve">Review of Economics and Statistics</w:t>
       </w:r>
       <w:r>
-        <w:t xml:space="preserve"> (90:3), pp. 414–427.</w:t>
+        <w:t xml:space="preserve"> (90:3), pp. 414–427. https://doi.org/10.1162/rest.90.3.414</w:t>
       </w:r>
     </w:p>
     <w:p>
@@ -7391,7 +6258,7 @@
         <w:t xml:space="preserve">Harvard Data Science Review</w:t>
       </w:r>
       <w:r>
-        <w:t xml:space="preserve"> (6:2).</w:t>
+        <w:t xml:space="preserve"> (6:2). https://doi.org/10.1162/99608f92.5317da47</w:t>
       </w:r>
     </w:p>
     <w:p>
@@ -7409,7 +6276,7 @@
         <w:t xml:space="preserve">Information Systems Research</w:t>
       </w:r>
       <w:r>
-        <w:t xml:space="preserve"> (articles in advance) (https://doi.org/10.1287/isre.2021.0601).</w:t>
+        <w:t xml:space="preserve"> (articles in advance). https://doi.org/10.1287/isre.2021.0601</w:t>
       </w:r>
     </w:p>
     <w:p>
@@ -7427,7 +6294,7 @@
         <w:t xml:space="preserve">Journal of Management</w:t>
       </w:r>
       <w:r>
-        <w:t xml:space="preserve"> (37:1), pp. 39–67.</w:t>
+        <w:t xml:space="preserve"> (37:1), pp. 39–67. https://doi.org/10.1177/0149206310388419</w:t>
       </w:r>
     </w:p>
     <w:p>
@@ -7445,7 +6312,7 @@
         <w:t xml:space="preserve">Controlled Clinical Trials</w:t>
       </w:r>
       <w:r>
-        <w:t xml:space="preserve"> (7:3), pp. 177–188.</w:t>
+        <w:t xml:space="preserve"> (7:3), pp. 177–188. https://doi.org/10.1016/0197-2456(86)90046-2</w:t>
       </w:r>
     </w:p>
     <w:p>
@@ -7463,7 +6330,7 @@
         <w:t xml:space="preserve">Journal of the American Statistical Association</w:t>
       </w:r>
       <w:r>
-        <w:t xml:space="preserve"> (51:274), pp. 228–242.</w:t>
+        <w:t xml:space="preserve"> (51:274), pp. 228–242. https://doi.org/10.2307/2281343</w:t>
       </w:r>
     </w:p>
     <w:p>
@@ -7481,7 +6348,7 @@
         <w:t xml:space="preserve">ACM Computing Surveys</w:t>
       </w:r>
       <w:r>
-        <w:t xml:space="preserve"> (46:4), Article 44.</w:t>
+        <w:t xml:space="preserve"> (46:4), Article 44. https://doi.org/10.1145/2523813</w:t>
       </w:r>
     </w:p>
     <w:p>
@@ -7499,7 +6366,7 @@
         <w:t xml:space="preserve">Econometrica</w:t>
       </w:r>
       <w:r>
-        <w:t xml:space="preserve"> (52:3), pp. 681–700.</w:t>
+        <w:t xml:space="preserve"> (52:3), pp. 701–720. https://doi.org/10.2307/1913472</w:t>
       </w:r>
     </w:p>
     <w:p>
@@ -7517,7 +6384,7 @@
         <w:t xml:space="preserve">Econometrica</w:t>
       </w:r>
       <w:r>
-        <w:t xml:space="preserve"> (52:2), pp. 271–320.</w:t>
+        <w:t xml:space="preserve"> (52:2), pp. 271–320. https://doi.org/10.2307/1911491</w:t>
       </w:r>
     </w:p>
     <w:p>
@@ -7535,7 +6402,7 @@
         <w:t xml:space="preserve">Review of Economic Studies</w:t>
       </w:r>
       <w:r>
-        <w:t xml:space="preserve"> (60:3), pp. 497–529.</w:t>
+        <w:t xml:space="preserve"> (60:3), pp. 497–529. https://doi.org/10.2307/2298122</w:t>
       </w:r>
     </w:p>
     <w:p>
@@ -7553,7 +6420,7 @@
         <w:t xml:space="preserve">Oxford Bulletin of Economics and Statistics</w:t>
       </w:r>
       <w:r>
-        <w:t xml:space="preserve"> (57:1), pp. 129–138.</w:t>
+        <w:t xml:space="preserve"> (57:1), pp. 129–138. https://doi.org/10.1111/j.1468-0084.1995.tb00031.x</w:t>
       </w:r>
     </w:p>
     <w:p>
@@ -7571,7 +6438,7 @@
         <w:t xml:space="preserve">IEEE Transactions on Software Engineering</w:t>
       </w:r>
       <w:r>
-        <w:t xml:space="preserve"> (25:4), pp. 493–509.</w:t>
+        <w:t xml:space="preserve"> (25:4), pp. 493–509. https://doi.org/10.1109/32.799945</w:t>
       </w:r>
     </w:p>
     <w:p>
@@ -7589,7 +6456,7 @@
         <w:t xml:space="preserve">Proceedings of the 9th IEEE Working Conference on Mining Software Repositories (MSR)</w:t>
       </w:r>
       <w:r>
-        <w:t xml:space="preserve">, pp. 179–188.</w:t>
+        <w:t xml:space="preserve">, pp. 179–188. https://doi.org/10.1109/MSR.2012.6224279</w:t>
       </w:r>
     </w:p>
     <w:p>
@@ -7607,7 +6474,7 @@
         <w:t xml:space="preserve">Quarterly Journal of Economics</w:t>
       </w:r>
       <w:r>
-        <w:t xml:space="preserve"> (123:3), pp. 863–904.</w:t>
+        <w:t xml:space="preserve"> (123:3), pp. 863–904. https://doi.org/10.1162/qjec.2008.123.3.863</w:t>
       </w:r>
     </w:p>
     <w:p>
@@ -7615,7 +6482,7 @@
         <w:pStyle w:val="Bibliography"/>
       </w:pPr>
       <w:r>
-        <w:t xml:space="preserve">Lazaridou, A., Kuncoro, A., Gribovskaya, E., Agrawal, D., Liska, A., Terzi, T., et al. 2021. “Mind the Gap: Assessing Temporal Generalization in Neural Language Models,” in </w:t>
+        <w:t xml:space="preserve">Lazaridou, A., Kuncoro, A., Gribovskaya, E., Agrawal, D., Liska, A., Terzi, T., Gimenez, M., de Masson d’Autume, C., Kocisky, T., Ruder, S., Yogatama, D., Cao, K., Young, S., and Blunsom, P. 2021. “Mind the Gap: Assessing Temporal Generalization in Neural Language Models,” in </w:t>
       </w:r>
       <w:r>
         <w:rPr>
@@ -7643,7 +6510,7 @@
         <w:t xml:space="preserve">Proceedings of the IEEE</w:t>
       </w:r>
       <w:r>
-        <w:t xml:space="preserve"> (68:9), pp. 1060–1076.</w:t>
+        <w:t xml:space="preserve"> (68:9), pp. 1060–1076. https://doi.org/10.1109/PROC.1980.11805</w:t>
       </w:r>
     </w:p>
     <w:p>
@@ -7661,7 +6528,7 @@
         <w:t xml:space="preserve">Journal of Industrial Economics</w:t>
       </w:r>
       <w:r>
-        <w:t xml:space="preserve"> (50:2), pp. 197–234.</w:t>
+        <w:t xml:space="preserve"> (50:2), pp. 197–234. https://doi.org/10.1111/1467-6451.00174</w:t>
       </w:r>
     </w:p>
     <w:p>
@@ -7679,7 +6546,7 @@
         <w:t xml:space="preserve">Proceedings of the 2022 Conference of the North American Chapter of the Association for Computational Linguistics (NAACL)</w:t>
       </w:r>
       <w:r>
-        <w:t xml:space="preserve">.</w:t>
+        <w:t xml:space="preserve">, pp. 5944–5958. https://doi.org/10.18653/v1/2022.naacl-main.435</w:t>
       </w:r>
     </w:p>
     <w:p>
@@ -7697,7 +6564,7 @@
         <w:t xml:space="preserve">Quarterly Journal of Economics</w:t>
       </w:r>
       <w:r>
-        <w:t xml:space="preserve"> (117:4), pp. 1295–1328.</w:t>
+        <w:t xml:space="preserve"> (117:4), pp. 1295–1328. https://doi.org/10.1162/003355302320935034</w:t>
       </w:r>
     </w:p>
     <w:p>
@@ -7715,7 +6582,7 @@
         <w:t xml:space="preserve">Quarterly Journal of Economics</w:t>
       </w:r>
       <w:r>
-        <w:t xml:space="preserve"> (123:4), pp. 1415–1464.</w:t>
+        <w:t xml:space="preserve"> (123:4), pp. 1415–1464. https://doi.org/10.1162/qjec.2008.123.4.1415</w:t>
       </w:r>
     </w:p>
     <w:p>
@@ -7733,7 +6600,7 @@
         <w:t xml:space="preserve">Review of Economic Studies</w:t>
       </w:r>
       <w:r>
-        <w:t xml:space="preserve"> (73:3), pp. 793–821.</w:t>
+        <w:t xml:space="preserve"> (73:3), pp. 793–821. https://doi.org/10.1111/j.1467-937X.2006.00396.x</w:t>
       </w:r>
     </w:p>
     <w:p>
@@ -7751,7 +6618,7 @@
         <w:t xml:space="preserve">Econometrica</w:t>
       </w:r>
       <w:r>
-        <w:t xml:space="preserve"> (55:5), pp. 999–1033.</w:t>
+        <w:t xml:space="preserve"> (55:5), pp. 999–1033. https://doi.org/10.2307/1911259</w:t>
       </w:r>
     </w:p>
     <w:p>
@@ -7759,7 +6626,7 @@
         <w:pStyle w:val="Bibliography"/>
       </w:pPr>
       <w:r>
-        <w:t xml:space="preserve">Sculley, D., Holt, G., Golovin, D., Davydov, E., Phillips, T., Ebner, D., et al. 2015. “Hidden Technical Debt in Machine Learning Systems,” in </w:t>
+        <w:t xml:space="preserve">Sculley, D., Holt, G., Golovin, D., Davydov, E., Phillips, T., Ebner, D., Chaudhary, V., Young, M., Crespo, J.-F., and Dennison, D. 2015. “Hidden Technical Debt in Machine Learning Systems,” in </w:t>
       </w:r>
       <w:r>
         <w:rPr>
@@ -7769,7 +6636,7 @@
         <w:t xml:space="preserve">Advances in Neural Information Processing Systems</w:t>
       </w:r>
       <w:r>
-        <w:t xml:space="preserve"> (28).</w:t>
+        <w:t xml:space="preserve"> (28), pp. 2503–2511.</w:t>
       </w:r>
     </w:p>
     <w:p>
@@ -7787,7 +6654,7 @@
         <w:t xml:space="preserve">Review of Economic Studies</w:t>
       </w:r>
       <w:r>
-        <w:t xml:space="preserve"> (44:2), pp. 287–303.</w:t>
+        <w:t xml:space="preserve"> (44:2), pp. 287–303. https://doi.org/10.2307/2297067</w:t>
       </w:r>
     </w:p>
     <w:p>
@@ -7805,7 +6672,7 @@
         <w:t xml:space="preserve">Journal of Monetary Economics</w:t>
       </w:r>
       <w:r>
-        <w:t xml:space="preserve"> (50:3), pp. 665–690.</w:t>
+        <w:t xml:space="preserve"> (50:3), pp. 665–690. https://doi.org/10.1016/S0304-3932(03)00029-1</w:t>
       </w:r>
     </w:p>
     <w:p>
@@ -7823,7 +6690,7 @@
         <w:t xml:space="preserve">Information Systems Research</w:t>
       </w:r>
       <w:r>
-        <w:t xml:space="preserve"> (articles in advance) (https://doi.org/10.1287/isre.2024.1361).</w:t>
+        <w:t xml:space="preserve"> (articles in advance). https://doi.org/10.1287/isre.2024.1361</w:t>
       </w:r>
     </w:p>
     <w:p>
@@ -7841,7 +6708,7 @@
         <w:t xml:space="preserve">Quarterly Journal of Economics</w:t>
       </w:r>
       <w:r>
-        <w:t xml:space="preserve"> (87:3), pp. 355–374.</w:t>
+        <w:t xml:space="preserve"> (87:3), pp. 355–374. https://doi.org/10.2307/1882010</w:t>
       </w:r>
     </w:p>
     <w:p>
@@ -7859,7 +6726,7 @@
         <w:t xml:space="preserve">Proceedings of the 2nd International Conference on Software Engineering</w:t>
       </w:r>
       <w:r>
-        <w:t xml:space="preserve">, pp. 492–497.</w:t>
+        <w:t xml:space="preserve">, San Francisco: IEEE Computer Society Press, pp. 492–497.</w:t>
       </w:r>
     </w:p>
     <w:p>
@@ -7877,7 +6744,7 @@
         <w:t xml:space="preserve">Journal of Political Economy</w:t>
       </w:r>
       <w:r>
-        <w:t xml:space="preserve"> (88:1), pp. 1–23.</w:t>
+        <w:t xml:space="preserve"> (88:1), pp. 1–23. https://doi.org/10.1086/260845</w:t>
       </w:r>
     </w:p>
     <w:p>
@@ -7895,7 +6762,7 @@
         <w:t xml:space="preserve">Organization Science</w:t>
       </w:r>
       <w:r>
-        <w:t xml:space="preserve"> (14:2), pp. 209–223.</w:t>
+        <w:t xml:space="preserve"> (14:2), pp. 209–223. https://doi.org/10.1287/orsc.14.2.209.14992</w:t>
       </w:r>
     </w:p>
     <w:sectPr>

</xml_diff>

<commit_message>
Update RQ3 text with one-lag control coefficients from the 999-draw run
Co-Authored-By: Claude Sonnet 5.5 <noreply@anthropic.com>
Claude-Session: https://claude.ai/code/session_01TRgf3y9VxaCYQ3g7Rgi1uE
</commit_message>
<xml_diff>
--- a/revised/Manuscript_MISQ_Format_Final.docx
+++ b/revised/Manuscript_MISQ_Format_Final.docx
@@ -158,13 +158,11 @@
         <w:t xml:space="preserve">The answer to RQ3 is that release probabilities respond to the volume of user issues but not distinguishably to bug reports as such. With non-bug issues held fixed, one standard deviation more bug reports in the previous week raises the log-odds of a release by 0.26 (wild cluster bootstrap p = 0.01), </w:t>
       </w:r>
       <w:r>
-        <w:rPr>
-          <w:highlight w:val="yellow"/>
-        </w:rPr>
-        <w:t xml:space="preserve">a response of about the same size as that to non-bug issues (0.22)</w:t>
-      </w:r>
-      <w:r>
-        <w:t xml:space="preserve">, and the additional response to bug reports at a given total volume is positive but not significant (0.19; wild cluster bootstrap p = 0.18). Releases show no detectable response to 38 upstream model launches, although release notes often mention a new model after its launch, which suggests that the content of releases responds while their timing does not. </w:t>
+        <w:rPr/>
+        <w:t xml:space="preserve">a response of about the same size as that to non-bug issues (0.23)</w:t>
+      </w:r>
+      <w:r>
+        <w:t xml:space="preserve">, and the additional response to bug reports at a given total volume is positive but not significant (0.19; wild cluster bootstrap p = 0.20). Releases show no detectable response to 38 upstream model launches, although release notes often mention a new model after its launch, which suggests that the content of releases responds while their timing does not. </w:t>
       </w:r>
     </w:p>
     <w:p>
@@ -5424,10 +5422,8 @@
         <w:t xml:space="preserve"> Because several of our results are null, for each of them we report a two one-sided test (TOST) p-value against a smallest effect of interest, the smallest bound at which equivalence would hold at the 5 percent level (the absolute estimate plus 1.645 standard errors), and the minimum detectable effect at 80 percent power (2.8 standard errors). The smallest effects of interest are a 2 percent weekly increase in the bug rate (RQ1); a log-odds of 0.25 per standard deviation of bug reports (RQ3), </w:t>
       </w:r>
       <w:r>
-        <w:rPr>
-          <w:highlight w:val="yellow"/>
-        </w:rPr>
-        <w:t xml:space="preserve">which is about the size of the response to non-bug issues that the data detect (Section 5.3)</w:t>
+        <w:rPr/>
+        <w:t xml:space="preserve">which is about the size of the response to non-bug issues that the data detect (0.23; Section 5.3)</w:t>
       </w:r>
       <w:r>
         <w:t xml:space="preserve">; and 5 percentage points for upstream launches, about one eighth of the pre-launch release rate. These bounds are anchored to the data and are not independent of them, which is why the smallest bound for equivalence is reported as well and readers can apply their own.</w:t>
@@ -5606,10 +5602,8 @@
         <w:t xml:space="preserve">Releases respond to the volume of user issues. With non-bug issues held fixed, one standard deviation more bug reports (in logs) in the previous week raises the log-odds of a release by 0.261 (clustered standard error 0.095; p = 0.01; wild cluster bootstrap p = 0.01). </w:t>
       </w:r>
       <w:r>
-        <w:rPr>
-          <w:highlight w:val="yellow"/>
-        </w:rPr>
-        <w:t xml:space="preserve">The point estimate on non-bug issues in the same model is 0.220, close to that on bug reports, so releases follow the overall flow of user reports at least as much as they follow defects.</w:t>
+        <w:rPr/>
+        <w:t xml:space="preserve">One standard deviation more non-bug issues in the same model raises the log-odds by 0.233 (0.082; wild cluster bootstrap p &lt; 0.01), close to the effect of bug reports, so releases follow the overall flow of user reports at least as much as they follow defects.</w:t>
       </w:r>
       <w:r>
         <w:t xml:space="preserve"> The three-week average of bug reports gives 0.332 (0.108; wild cluster bootstrap p = 0.01), and the three lags entered separately give 0.184, 0.096, and 0.055.</w:t>
@@ -5620,7 +5614,7 @@
         <w:pStyle w:val="FirstParagraph"/>
       </w:pPr>
       <w:r>
-        <w:t xml:space="preserve">Holding total issues fixed instead, the coefficient on bug reports is 0.191 (0.123; p = 0.12; wild cluster bootstrap p = 0.18), and the three-week average gives 0.272 (0.123; p = 0.03; wild cluster bootstrap p = 0.06). The positive sign leaves room for some response to bug reports beyond overall volume, but it is not significant at the 5 percent level under the wild cluster bootstrap for either measure. An approximate 95 percent interval for the one-week coefficient runs from −0.05 to 0.43 in log-odds, which is compatible with no extra response and with an increase in the odds of a release of up to about 54 percent per standard deviation.</w:t>
+        <w:t xml:space="preserve">Holding total issues fixed instead, the coefficient on bug reports is 0.191 (0.123; p = 0.12; wild cluster bootstrap p = 0.20) and that on total issues is 0.225 (0.105; wild cluster bootstrap p = 0.04), and the three-week average of bug reports gives 0.272 (0.123; p = 0.03; wild cluster bootstrap p = 0.06). The positive sign leaves room for some response to bug reports beyond overall volume, but it is not significant at the 5 percent level under the wild cluster bootstrap for either measure. An approximate 95 percent interval for the one-week coefficient runs from −0.05 to 0.43 in log-odds, which is compatible with no extra response and with an increase in the odds of a release of up to about 54 percent per standard deviation.</w:t>
       </w:r>
     </w:p>
     <w:p>
@@ -5628,7 +5622,7 @@
         <w:pStyle w:val="FirstParagraph"/>
       </w:pPr>
       <w:r>
-        <w:t xml:space="preserve">Hot-fixes do not appear to account for these patterns. Dropping the week right after a release, where hot-fixes follow the burst of issues that the release provokes, gives 0.251 (0.092; wild cluster bootstrap p = 0.02) for the one-week lag and 0.318 (0.098; wild cluster bootstrap p = 0.02) for the three-week average with non-bug issues held fixed, and 0.143 (0.129; wild cluster bootstrap p = 0.32) and 0.218 (0.120; wild cluster bootstrap p = 0.10) with total issues held fixed. H4 is therefore partly supported: release timing responds to user activity, of which bug reports are a component, but we cannot show that it responds to bug reports as such. The test is more demanding than the age profile, because it asks whether an observable state moves releases, which state dependence requires, and only part of that state is a sign of degradation.</w:t>
+        <w:t xml:space="preserve">Hot-fixes do not appear to account for these patterns. Dropping the week right after a release, where hot-fixes follow the burst of issues that the release provokes, gives 0.251 (0.092; wild cluster bootstrap p = 0.03) for the one-week lag and 0.318 (0.098; wild cluster bootstrap p = 0.01) for the three-week average with non-bug issues held fixed, and 0.143 (0.129; wild cluster bootstrap p = 0.32) and 0.218 (0.120; wild cluster bootstrap p = 0.11) with total issues held fixed. The coefficients on non-bug and total issues in these samples are 0.250 (0.078) and 0.303 (0.115). H4 is therefore partly supported: release timing responds to user activity, of which bug reports are a component, but we cannot show that it responds to bug reports as such. The test is more demanding than the age profile, because it asks whether an observable state moves releases, which state dependence requires, and only part of that state is a sign of degradation.</w:t>
       </w:r>
     </w:p>
     <w:p>

</xml_diff>

<commit_message>
Remove Section 3.5 simulation benchmark (results not reproducible)
Co-Authored-By: Claude Sonnet 5.5 <noreply@anthropic.com>
Claude-Session: https://claude.ai/code/session_01TRgf3y9VxaCYQ3g7Rgi1uE
</commit_message>
<xml_diff>
--- a/revised/Manuscript_MISQ_Format_Final.docx
+++ b/revised/Manuscript_MISQ_Format_Final.docx
@@ -945,103 +945,7 @@
         <w:pStyle w:val="BodyText"/>
       </w:pPr>
       <w:r>
-        <w:t xml:space="preserve">RQ1 tests H1. RQ2 discriminates between H2a and H2b. RQ3 tests H4 directly, using the signals that a maintainer can observe, RQ4 tests H5, and H3 governs how the pooled estimates should be read. The refresh cost RC is identified only under H1, H2a, and H4, so we do not report an estimate of it.</w:t>
-      </w:r>
-    </w:p>
-    <w:p>
-      <w:pPr>
-        <w:pStyle w:val="Heading3"/>
-      </w:pPr>
-      <w:r>
-        <w:t xml:space="preserve">3.5 Simulation Benchmark</w:t>
-      </w:r>
-    </w:p>
-    <w:p>
-      <w:pPr>
-        <w:pStyle w:val="FirstParagraph"/>
-      </w:pPr>
-      <w:r>
-        <w:t xml:space="preserve">To check that the tests would detect the state-dependent signatures if they were present, we simulated the dynamic version of the model (Appendix A) with </w:t>
-      </w:r>
-      <w:r>
-        <w:rPr>
-          <w:i/>
-          <w:iCs/>
-        </w:rPr>
-        <w:t xml:space="preserve">γ</w:t>
-      </w:r>
-      <w:r>
-        <w:t xml:space="preserve">=0.5, </w:t>
-      </w:r>
-      <w:r>
-        <w:rPr>
-          <w:i/>
-          <w:iCs/>
-        </w:rPr>
-        <w:t xml:space="preserve">RC</w:t>
-      </w:r>
-      <w:r>
-        <w:t xml:space="preserve">=40, </w:t>
-      </w:r>
-      <w:r>
-        <w:rPr>
-          <w:i/>
-          <w:iCs/>
-        </w:rPr>
-        <w:t xml:space="preserve">λ₀</w:t>
-      </w:r>
-      <w:r>
-        <w:t xml:space="preserve">=5, Poisson(1) drift increments, and a discount factor of 0.95. The optimal policy refreshes at a drift of 14, where the expected error rate is 12.0, or 2.4 times the baseline. Across 100 replications of 3,000 weeks, </w:t>
-      </w:r>
-      <w:r>
-        <w:rPr>
-          <w:i/>
-          <w:iCs/>
-        </w:rPr>
-        <w:t xml:space="preserve">γ</w:t>
-      </w:r>
-      <w:r>
-        <w:t xml:space="preserve"> was recovered with a mean of 0.499 (SD 0.011), so the central parameter of (1) is well identified whenever errors and drift are observed. The refresh cost is harder to recover. A two-step estimator gave </w:t>
-      </w:r>
-      <w:r>
-        <w:rPr>
-          <w:i/>
-          <w:iCs/>
-        </w:rPr>
-        <w:t xml:space="preserve">RC</w:t>
-      </w:r>
-      <w:r>
-        <w:t xml:space="preserve"> with a mean of 39.9 (SD 1.0), and estimating </w:t>
-      </w:r>
-      <w:r>
-        <w:rPr>
-          <w:i/>
-          <w:iCs/>
-        </w:rPr>
-        <w:t xml:space="preserve">γ</w:t>
-      </w:r>
-      <w:r>
-        <w:t xml:space="preserve"> and </w:t>
-      </w:r>
-      <w:r>
-        <w:rPr>
-          <w:i/>
-          <w:iCs/>
-        </w:rPr>
-        <w:t xml:space="preserve">RC</w:t>
-      </w:r>
-      <w:r>
-        <w:t xml:space="preserve"> jointly from choice data alone gave a mean of 40.1 (SD 3.0). Precision falls with sample length: the SD of the estimated </w:t>
-      </w:r>
-      <w:r>
-        <w:rPr>
-          <w:i/>
-          <w:iCs/>
-        </w:rPr>
-        <w:t xml:space="preserve">RC</w:t>
-      </w:r>
-      <w:r>
-        <w:t xml:space="preserve"> is 6.7 at 100 weeks, 4.8 at 250 weeks, 2.8 at 500 weeks, and 2.1 at 1,000 weeks. The repositories we study have between 143 and 197 weekly observations, so a cost estimate would be imprecise even under ideal conditions. This is a further reason to concentrate on the shape of the hazard rather than on the level of the cost.</w:t>
+        <w:t xml:space="preserve">RQ1 tests H1. RQ2 discriminates between H2a and H2b. RQ3 tests H4 directly, using the signals that a maintainer can observe, RQ4 tests H5, and H3 governs how the pooled estimates should be read. The refresh cost RC is identified only under H1, H2a, and H4, and with 143 to 197 weekly observations per repository an estimate of it would be imprecise, so we do not report one and concentrate on the shape of the hazard rather than on the level of the cost.</w:t>
       </w:r>
     </w:p>
     <w:p>

</xml_diff>

<commit_message>
Verify all manuscript numbers; fix tau2 and hand-check count; add verification report
Co-Authored-By: Claude Sonnet 5.5 <noreply@anthropic.com>
Claude-Session: https://claude.ai/code/session_01TRgf3y9VxaCYQ3g7Rgi1uE
</commit_message>
<xml_diff>
--- a/revised/Manuscript_MISQ_Format_Final.docx
+++ b/revised/Manuscript_MISQ_Format_Final.docx
@@ -5411,7 +5411,7 @@
         <w:t xml:space="preserve">τ²</w:t>
       </w:r>
       <w:r>
-        <w:t xml:space="preserve"> = 0.050), which is not distinguishable from zero. Eight of the 19 repository-level slopes are positive. One, for vLLM, is significantly positive at the 5 percent level (a ratio of slope to standard error of about 2.4), which is about what chance alone would produce among 19 tests and does not survive a correction for multiple testing; the next largest ratio, for lm-evaluation-harness, is about 1.8 (Table 1). H2a is not supported in 18 of the 19 repositories.</w:t>
+        <w:t xml:space="preserve"> = 0.049), which is not distinguishable from zero. Eight of the 19 repository-level slopes are positive. One, for vLLM, is significantly positive at the 5 percent level (a ratio of slope to standard error of about 2.4), which is about what chance alone would produce among 19 tests and does not survive a correction for multiple testing; the next largest ratio, for lm-evaluation-harness, is about 1.8 (Table 1). H2a is not supported in 18 of the 19 repositories.</w:t>
       </w:r>
     </w:p>
     <w:p>
@@ -5637,7 +5637,7 @@
         <w:t xml:space="preserve">Release content. </w:t>
       </w:r>
       <w:r>
-        <w:t xml:space="preserve">We keep 1,405 releases from all 19 repositories that have at least three itemized entries; on average 32 percent of the entries are fixes. The share of fix entries is, if anything, lower after weeks with more bug reports. One standard deviation more bug reports in the preceding four weeks changes the share by −0.021 (clustered standard error 0.008; p = 0.01; wild cluster bootstrap p = 0.07), controlling for non-bug issues, the time since the previous release, a trend, and repository fixed effects. The sign is opposite to the one a content response would imply, and the wild cluster bootstrap p-value does not reach 5 percent, so we find no evidence that the content of releases responds to bug reports either. A hand check of 12 randomly drawn entries found the three flagged as fixes to be fixes and the nine others to be other changes; this small check says nothing about the recall of the classifier, and the result should be read as exploratory.</w:t>
+        <w:t xml:space="preserve">We keep 1,405 releases from all 19 repositories that have at least three itemized entries; on average 32 percent of the entries are fixes. The share of fix entries is, if anything, lower after weeks with more bug reports. One standard deviation more bug reports in the preceding four weeks changes the share by −0.021 (clustered standard error 0.008; p = 0.01; wild cluster bootstrap p = 0.07), controlling for non-bug issues, the time since the previous release, a trend, and repository fixed effects. The sign is opposite to the one a content response would imply, and the wild cluster bootstrap p-value does not reach 5 percent, so we find no evidence that the content of releases responds to bug reports either. A hand check of 12 randomly drawn entries found the two flagged as fixes to be fixes and none of the other ten to be an obvious fix, although one of them was a contributor name and not a change entry, which the classifier now excludes; this small check says nothing about the recall of the classifier, and the result should be read as exploratory.</w:t>
       </w:r>
     </w:p>
     <w:p>

</xml_diff>